<commit_message>
1123 nga landa prarparake
</commit_message>
<xml_diff>
--- a/1123-Zaskok-Latifja/3-Mbështjellësi-i-lëndës-1123-Zaskok-Latifja.docx
+++ b/1123-Zaskok-Latifja/3-Mbështjellësi-i-lëndës-1123-Zaskok-Latifja.docx
@@ -419,7 +419,7 @@
                           <w:szCs w:val="30"/>
                           <w:u w:val="single"/>
                         </w:rPr>
-                        <w:t>102/2026</w:t>
+                        <w:t>241/2026</w:t>
                       </w:r>
                     </w:p>
                   </w:txbxContent>
@@ -629,7 +629,7 @@
                           <w:szCs w:val="30"/>
                           <w:u w:val="single"/>
                         </w:rPr>
-                        <w:t>29</w:t>
+                        <w:t>1</w:t>
                       </w:r>
                       <w:r>
                         <w:rPr>
@@ -639,7 +639,7 @@
                           <w:szCs w:val="30"/>
                           <w:u w:val="single"/>
                         </w:rPr>
-                        <w:t>/</w:t>
+                        <w:t>9</w:t>
                       </w:r>
                       <w:r>
                         <w:rPr>
@@ -649,7 +649,27 @@
                           <w:szCs w:val="30"/>
                           <w:u w:val="single"/>
                         </w:rPr>
-                        <w:t>04</w:t>
+                        <w:t>/</w:t>
+                      </w:r>
+                      <w:r>
+                        <w:rPr>
+                          <w:rFonts w:ascii="Times New Roman" w:hAnsi="Times New Roman" w:cs="Times New Roman"/>
+                          <w:b/>
+                          <w:sz w:val="30"/>
+                          <w:szCs w:val="30"/>
+                          <w:u w:val="single"/>
+                        </w:rPr>
+                        <w:t>0</w:t>
+                      </w:r>
+                      <w:r>
+                        <w:rPr>
+                          <w:rFonts w:ascii="Times New Roman" w:hAnsi="Times New Roman" w:cs="Times New Roman"/>
+                          <w:b/>
+                          <w:sz w:val="30"/>
+                          <w:szCs w:val="30"/>
+                          <w:u w:val="single"/>
+                        </w:rPr>
+                        <w:t>9</w:t>
                       </w:r>
                       <w:r>
                         <w:rPr>

</xml_diff>